<commit_message>
update: cleaner whitepaper v1.0 without em-dash constructions
</commit_message>
<xml_diff>
--- a/public/Gramketing_Whitepaper_v1.0.docx
+++ b/public/Gramketing_Whitepaper_v1.0.docx
@@ -150,7 +150,7 @@
           <w:sz w:val="22"/>
           <w:szCs w:val="22"/>
         </w:rPr>
-        <w:t xml:space="preserve">Gramketing is a decentralised, performance-based marketing platform built on the TON (The Open Network) blockchain. It enables blockchain projects to create permissionless reward pools funded by their own tokens, which are distributed to contributors and promoters whose verified social activity — measured by views, likes, reposts, and reactions on X (Twitter) and Telegram — generates the greatest reach.</w:t>
+        <w:t xml:space="preserve">Gramketing is a decentralised, performance-based marketing platform built on the TON (The Open Network) blockchain. It enables blockchain projects to create permissionless reward pools funded by their own tokens, which are distributed to contributors and promoters whose verified social activity (views, likes, reposts, and reactions on X and Telegram) generates the greatest reach.</w:t>
       </w:r>
     </w:p>
     <w:p>
@@ -471,45 +471,45 @@
           <w:sz w:val="22"/>
           <w:szCs w:val="22"/>
         </w:rPr>
-        <w:t xml:space="preserve">Unverifiable reach — influencers and KOLs (Key Opinion Leaders) present follower counts and estimated impressions that cannot be independently confirmed.</w:t>
-      </w:r>
-    </w:p>
-    <w:p>
-      <w:pPr>
-        <w:pStyle w:val="ListParagraph"/>
-        <w:numPr>
-          <w:ilvl w:val="0"/>
-          <w:numId w:val="2"/>
-        </w:numPr>
-        <w:spacing w:after="40" w:before="40"/>
-      </w:pPr>
-      <w:r>
-        <w:rPr>
-          <w:rFonts w:ascii="Arial" w:cs="Arial" w:eastAsia="Arial" w:hAnsi="Arial"/>
-          <w:color w:val="333333"/>
-          <w:sz w:val="22"/>
-          <w:szCs w:val="22"/>
-        </w:rPr>
-        <w:t xml:space="preserve">Upfront risk — projects pay before any result is delivered, with no recourse if content underperforms.</w:t>
-      </w:r>
-    </w:p>
-    <w:p>
-      <w:pPr>
-        <w:pStyle w:val="ListParagraph"/>
-        <w:numPr>
-          <w:ilvl w:val="0"/>
-          <w:numId w:val="2"/>
-        </w:numPr>
-        <w:spacing w:after="40" w:before="40"/>
-      </w:pPr>
-      <w:r>
-        <w:rPr>
-          <w:rFonts w:ascii="Arial" w:cs="Arial" w:eastAsia="Arial" w:hAnsi="Arial"/>
-          <w:color w:val="333333"/>
-          <w:sz w:val="22"/>
-          <w:szCs w:val="22"/>
-        </w:rPr>
-        <w:t xml:space="preserve">Misaligned incentives — a paid promoter has no ongoing financial reason to care whether content actually performs after payment is received.</w:t>
+        <w:t xml:space="preserve">Unverifiable reach. Influencers and KOLs present follower counts and estimated impressions that cannot be independently confirmed.</w:t>
+      </w:r>
+    </w:p>
+    <w:p>
+      <w:pPr>
+        <w:pStyle w:val="ListParagraph"/>
+        <w:numPr>
+          <w:ilvl w:val="0"/>
+          <w:numId w:val="2"/>
+        </w:numPr>
+        <w:spacing w:after="40" w:before="40"/>
+      </w:pPr>
+      <w:r>
+        <w:rPr>
+          <w:rFonts w:ascii="Arial" w:cs="Arial" w:eastAsia="Arial" w:hAnsi="Arial"/>
+          <w:color w:val="333333"/>
+          <w:sz w:val="22"/>
+          <w:szCs w:val="22"/>
+        </w:rPr>
+        <w:t xml:space="preserve">Upfront risk. Projects pay before any result is delivered, with no recourse if content underperforms.</w:t>
+      </w:r>
+    </w:p>
+    <w:p>
+      <w:pPr>
+        <w:pStyle w:val="ListParagraph"/>
+        <w:numPr>
+          <w:ilvl w:val="0"/>
+          <w:numId w:val="2"/>
+        </w:numPr>
+        <w:spacing w:after="40" w:before="40"/>
+      </w:pPr>
+      <w:r>
+        <w:rPr>
+          <w:rFonts w:ascii="Arial" w:cs="Arial" w:eastAsia="Arial" w:hAnsi="Arial"/>
+          <w:color w:val="333333"/>
+          <w:sz w:val="22"/>
+          <w:szCs w:val="22"/>
+        </w:rPr>
+        <w:t xml:space="preserve">Misaligned incentives. A paid promoter has no ongoing financial reason to care whether content performs after they have been paid.</w:t>
       </w:r>
     </w:p>
     <w:p>
@@ -1328,7 +1328,7 @@
           <w:sz w:val="22"/>
           <w:szCs w:val="22"/>
         </w:rPr>
-        <w:t xml:space="preserve">Retain no control over reward distribution after pool creation — the smart contract governs payouts</w:t>
+        <w:t xml:space="preserve">Retain no control over reward distribution after pool creation. The smart contract governs all payouts.</w:t>
       </w:r>
     </w:p>
     <w:p>
@@ -1677,102 +1677,102 @@
           <w:sz w:val="22"/>
           <w:szCs w:val="22"/>
         </w:rPr>
-        <w:t xml:space="preserve">Step 1 — Project connects TON wallet</w:t>
-      </w:r>
-    </w:p>
-    <w:p>
-      <w:pPr>
-        <w:pStyle w:val="ListParagraph"/>
-        <w:numPr>
-          <w:ilvl w:val="0"/>
-          <w:numId w:val="2"/>
-        </w:numPr>
-        <w:spacing w:after="40" w:before="40"/>
-      </w:pPr>
-      <w:r>
-        <w:rPr>
-          <w:rFonts w:ascii="Arial" w:cs="Arial" w:eastAsia="Arial" w:hAnsi="Arial"/>
-          <w:color w:val="333333"/>
-          <w:sz w:val="22"/>
-          <w:szCs w:val="22"/>
-        </w:rPr>
-        <w:t xml:space="preserve">Step 2 — Project selects duration, campaign type, and number of reward slots</w:t>
-      </w:r>
-    </w:p>
-    <w:p>
-      <w:pPr>
-        <w:pStyle w:val="ListParagraph"/>
-        <w:numPr>
-          <w:ilvl w:val="0"/>
-          <w:numId w:val="2"/>
-        </w:numPr>
-        <w:spacing w:after="40" w:before="40"/>
-      </w:pPr>
-      <w:r>
-        <w:rPr>
-          <w:rFonts w:ascii="Arial" w:cs="Arial" w:eastAsia="Arial" w:hAnsi="Arial"/>
-          <w:color w:val="333333"/>
-          <w:sz w:val="22"/>
-          <w:szCs w:val="22"/>
-        </w:rPr>
-        <w:t xml:space="preserve">Step 3 — Platform calculates access fee in $mGRAM or TON using live CoinGecko prices</w:t>
-      </w:r>
-    </w:p>
-    <w:p>
-      <w:pPr>
-        <w:pStyle w:val="ListParagraph"/>
-        <w:numPr>
-          <w:ilvl w:val="0"/>
-          <w:numId w:val="2"/>
-        </w:numPr>
-        <w:spacing w:after="40" w:before="40"/>
-      </w:pPr>
-      <w:r>
-        <w:rPr>
-          <w:rFonts w:ascii="Arial" w:cs="Arial" w:eastAsia="Arial" w:hAnsi="Arial"/>
-          <w:color w:val="333333"/>
-          <w:sz w:val="22"/>
-          <w:szCs w:val="22"/>
-        </w:rPr>
-        <w:t xml:space="preserve">Step 4 — Project approves access fee transaction (sent to Gramketing treasury wallet)</w:t>
-      </w:r>
-    </w:p>
-    <w:p>
-      <w:pPr>
-        <w:pStyle w:val="ListParagraph"/>
-        <w:numPr>
-          <w:ilvl w:val="0"/>
-          <w:numId w:val="2"/>
-        </w:numPr>
-        <w:spacing w:after="40" w:before="40"/>
-      </w:pPr>
-      <w:r>
-        <w:rPr>
-          <w:rFonts w:ascii="Arial" w:cs="Arial" w:eastAsia="Arial" w:hAnsi="Arial"/>
-          <w:color w:val="333333"/>
-          <w:sz w:val="22"/>
-          <w:szCs w:val="22"/>
-        </w:rPr>
-        <w:t xml:space="preserve">Step 5 — Project approves jetton deposit transaction (tokens sent to escrow smart contract)</w:t>
-      </w:r>
-    </w:p>
-    <w:p>
-      <w:pPr>
-        <w:pStyle w:val="ListParagraph"/>
-        <w:numPr>
-          <w:ilvl w:val="0"/>
-          <w:numId w:val="2"/>
-        </w:numPr>
-        <w:spacing w:after="40" w:before="40"/>
-      </w:pPr>
-      <w:r>
-        <w:rPr>
-          <w:rFonts w:ascii="Arial" w:cs="Arial" w:eastAsia="Arial" w:hAnsi="Arial"/>
-          <w:color w:val="333333"/>
-          <w:sz w:val="22"/>
-          <w:szCs w:val="22"/>
-        </w:rPr>
-        <w:t xml:space="preserve">Step 6 — Pool record created in database; smart contract initialized on-chain with pool ID, token amount, and reward slot configuration</w:t>
+        <w:t xml:space="preserve">Step 1: Connect TON wallet</w:t>
+      </w:r>
+    </w:p>
+    <w:p>
+      <w:pPr>
+        <w:pStyle w:val="ListParagraph"/>
+        <w:numPr>
+          <w:ilvl w:val="0"/>
+          <w:numId w:val="2"/>
+        </w:numPr>
+        <w:spacing w:after="40" w:before="40"/>
+      </w:pPr>
+      <w:r>
+        <w:rPr>
+          <w:rFonts w:ascii="Arial" w:cs="Arial" w:eastAsia="Arial" w:hAnsi="Arial"/>
+          <w:color w:val="333333"/>
+          <w:sz w:val="22"/>
+          <w:szCs w:val="22"/>
+        </w:rPr>
+        <w:t xml:space="preserve">Step 2: Select pool duration, campaign type, and number of reward slots</w:t>
+      </w:r>
+    </w:p>
+    <w:p>
+      <w:pPr>
+        <w:pStyle w:val="ListParagraph"/>
+        <w:numPr>
+          <w:ilvl w:val="0"/>
+          <w:numId w:val="2"/>
+        </w:numPr>
+        <w:spacing w:after="40" w:before="40"/>
+      </w:pPr>
+      <w:r>
+        <w:rPr>
+          <w:rFonts w:ascii="Arial" w:cs="Arial" w:eastAsia="Arial" w:hAnsi="Arial"/>
+          <w:color w:val="333333"/>
+          <w:sz w:val="22"/>
+          <w:szCs w:val="22"/>
+        </w:rPr>
+        <w:t xml:space="preserve">Step 3: The platform calculates the access fee in $mGRAM or TON using live CoinGecko prices</w:t>
+      </w:r>
+    </w:p>
+    <w:p>
+      <w:pPr>
+        <w:pStyle w:val="ListParagraph"/>
+        <w:numPr>
+          <w:ilvl w:val="0"/>
+          <w:numId w:val="2"/>
+        </w:numPr>
+        <w:spacing w:after="40" w:before="40"/>
+      </w:pPr>
+      <w:r>
+        <w:rPr>
+          <w:rFonts w:ascii="Arial" w:cs="Arial" w:eastAsia="Arial" w:hAnsi="Arial"/>
+          <w:color w:val="333333"/>
+          <w:sz w:val="22"/>
+          <w:szCs w:val="22"/>
+        </w:rPr>
+        <w:t xml:space="preserve">Step 4: Approve the access fee transaction, which is sent to the Gramketing treasury wallet</w:t>
+      </w:r>
+    </w:p>
+    <w:p>
+      <w:pPr>
+        <w:pStyle w:val="ListParagraph"/>
+        <w:numPr>
+          <w:ilvl w:val="0"/>
+          <w:numId w:val="2"/>
+        </w:numPr>
+        <w:spacing w:after="40" w:before="40"/>
+      </w:pPr>
+      <w:r>
+        <w:rPr>
+          <w:rFonts w:ascii="Arial" w:cs="Arial" w:eastAsia="Arial" w:hAnsi="Arial"/>
+          <w:color w:val="333333"/>
+          <w:sz w:val="22"/>
+          <w:szCs w:val="22"/>
+        </w:rPr>
+        <w:t xml:space="preserve">Step 5: Approve the jetton deposit transaction, sending tokens to the escrow smart contract</w:t>
+      </w:r>
+    </w:p>
+    <w:p>
+      <w:pPr>
+        <w:pStyle w:val="ListParagraph"/>
+        <w:numPr>
+          <w:ilvl w:val="0"/>
+          <w:numId w:val="2"/>
+        </w:numPr>
+        <w:spacing w:after="40" w:before="40"/>
+      </w:pPr>
+      <w:r>
+        <w:rPr>
+          <w:rFonts w:ascii="Arial" w:cs="Arial" w:eastAsia="Arial" w:hAnsi="Arial"/>
+          <w:color w:val="333333"/>
+          <w:sz w:val="22"/>
+          <w:szCs w:val="22"/>
+        </w:rPr>
+        <w:t xml:space="preserve">Step 6: The pool record is created in the database and the smart contract is initialised on-chain with the pool ID, token amount, and reward slot configuration</w:t>
       </w:r>
     </w:p>
     <w:p>
@@ -1909,7 +1909,7 @@
           <w:sz w:val="22"/>
           <w:szCs w:val="22"/>
         </w:rPr>
-        <w:t xml:space="preserve">Holder boosts and referral boosts recalculate in real time — selling tokens reduces boost immediately</w:t>
+        <w:t xml:space="preserve">Holder boosts and referral boosts recalculate in real time. Selling tokens reduces the boost at the next cycle.</w:t>
       </w:r>
     </w:p>
     <w:p>
@@ -1989,7 +1989,7 @@
           <w:sz w:val="22"/>
           <w:szCs w:val="22"/>
         </w:rPr>
-        <w:t xml:space="preserve">The leaderboard is frozen — no further submissions or scrape updates are processed</w:t>
+        <w:t xml:space="preserve">The leaderboard is frozen. No further submissions or scrape updates are processed.</w:t>
       </w:r>
     </w:p>
     <w:p>
@@ -3193,7 +3193,7 @@
           <w:sz w:val="22"/>
           <w:szCs w:val="22"/>
         </w:rPr>
-        <w:t xml:space="preserve">If a pool runs both X and Telegram campaigns simultaneously, points from each platform are totalled before boosts are applied. There is no cap on combined points — a participant active on both platforms earns from both.</w:t>
+        <w:t xml:space="preserve">If a pool runs both X and Telegram campaigns simultaneously, points from each platform are totalled before boosts are applied. There is no cap on combined points. A participant active on both platforms earns from both.</w:t>
       </w:r>
     </w:p>
     <w:p>
@@ -3288,7 +3288,7 @@
           <w:sz w:val="22"/>
           <w:szCs w:val="22"/>
         </w:rPr>
-        <w:t xml:space="preserve">Worked example — participant ranked #2:</w:t>
+        <w:t xml:space="preserve">Worked example for a participant ranked #2:</w:t>
       </w:r>
     </w:p>
     <w:p>
@@ -3872,7 +3872,7 @@
           <w:sz w:val="22"/>
           <w:szCs w:val="22"/>
         </w:rPr>
-        <w:t xml:space="preserve">The top holder in the pool is the reference point — if they sell, the reference shifts.</w:t>
+        <w:t xml:space="preserve">The top holder in the pool is the reference point. If they sell, the reference shifts to the next highest holder.</w:t>
       </w:r>
     </w:p>
     <w:p>
@@ -4555,7 +4555,7 @@
           <w:sz w:val="22"/>
           <w:szCs w:val="22"/>
         </w:rPr>
-        <w:t xml:space="preserve">Referring a wallet that never buys tokens contributes nothing — only token-holding referrals count.</w:t>
+        <w:t xml:space="preserve">Referring a wallet that never buys tokens contributes nothing to the boost. Only token-holding referrals count.</w:t>
       </w:r>
     </w:p>
     <w:p>
@@ -4630,7 +4630,7 @@
           <w:sz w:val="22"/>
           <w:szCs w:val="22"/>
         </w:rPr>
-        <w:t xml:space="preserve">When creating a pool, the project sets the number of reward slots — the count of top-ranked participants who will receive rewards. The minimum is 3 slots. There is no maximum.</w:t>
+        <w:t xml:space="preserve">When creating a pool, the project sets the number of reward slots. This determines how many top-ranked participants will receive rewards. The minimum is 3 slots with no maximum.</w:t>
       </w:r>
     </w:p>
     <w:p>
@@ -5584,7 +5584,7 @@
                 <w:sz w:val="20"/>
                 <w:szCs w:val="20"/>
               </w:rPr>
-              <w:t xml:space="preserve">Daily rate x days elapsed — distributed proportionally by points among top N winners at cancellation</w:t>
+              <w:t xml:space="preserve">Daily rate x days elapsed, distributed proportionally by points among top N winners at cancellation</w:t>
             </w:r>
           </w:p>
         </w:tc>
@@ -5816,7 +5816,7 @@
           <w:sz w:val="22"/>
           <w:szCs w:val="22"/>
         </w:rPr>
-        <w:t xml:space="preserve">Example: A 7-day pool cancelled on day 4 — participants share 4/7 of total rewards proportionally by their current points, and the project receives back 3/7 of deposited tokens. The platform retains the full access fee.</w:t>
+        <w:t xml:space="preserve">Example: A 7-day pool cancelled on day 4 means participants share 4/7 of the total rewards proportionally by their current points, and the project receives back 3/7 of the deposited tokens. The platform retains the full access fee.</w:t>
       </w:r>
     </w:p>
     <w:p>
@@ -5872,7 +5872,7 @@
           <w:sz w:val="22"/>
           <w:szCs w:val="22"/>
         </w:rPr>
-        <w:t xml:space="preserve">Gramketing's escrow system is implemented as a smart contract written in the Tact language and deployed on TON mainnet. The contract is generic — it supports any TEP-74 compliant jetton, meaning any TON token can be used as a reward pool without code changes.</w:t>
+        <w:t xml:space="preserve">Gramketing's escrow system is implemented as a smart contract written in the Tact language and deployed on TON mainnet. The contract is generic and supports any TEP-74 compliant jetton, so any TON token can be used as a reward without code changes.</w:t>
       </w:r>
     </w:p>
     <w:p>
@@ -6161,7 +6161,7 @@
                 <w:sz w:val="20"/>
                 <w:szCs w:val="20"/>
               </w:rPr>
-              <w:t xml:space="preserve">Any TON jetton — no hardcoded token addresses</w:t>
+              <w:t xml:space="preserve">Any TON jetton. No hardcoded token addresses.</w:t>
             </w:r>
           </w:p>
         </w:tc>
@@ -6281,7 +6281,7 @@
                 <w:sz w:val="20"/>
                 <w:szCs w:val="20"/>
               </w:rPr>
-              <w:t xml:space="preserve">Platform admin wallet — the only address that can trigger distribution or cancellation</w:t>
+              <w:t xml:space="preserve">Platform admin wallet. Only this address can trigger distribution or cancellation.</w:t>
             </w:r>
           </w:p>
         </w:tc>
@@ -6663,7 +6663,7 @@
                 <w:sz w:val="20"/>
                 <w:szCs w:val="20"/>
               </w:rPr>
-              <w:t xml:space="preserve">Jetton transfer — tokens locked in escrow</w:t>
+              <w:t xml:space="preserve">Jetton transfer that locks tokens in escrow</w:t>
             </w:r>
           </w:p>
         </w:tc>
@@ -6841,7 +6841,7 @@
                 <w:sz w:val="20"/>
                 <w:szCs w:val="20"/>
               </w:rPr>
-              <w:t xml:space="preserve">Splits tokens pro-rata by days elapsed — participant share distributed proportionally by points, remaining balance returned to project wallet</w:t>
+              <w:t xml:space="preserve">Splits tokens pro-rata by days elapsed. Participant share distributed by points, remaining balance returned to project wallet.</w:t>
             </w:r>
           </w:p>
         </w:tc>
@@ -6891,45 +6891,45 @@
           <w:sz w:val="22"/>
           <w:szCs w:val="22"/>
         </w:rPr>
-        <w:t xml:space="preserve">Only the admin wallet address can call DistributeRewards or CancelPool — all other callers are rejected.</w:t>
-      </w:r>
-    </w:p>
-    <w:p>
-      <w:pPr>
-        <w:pStyle w:val="ListParagraph"/>
-        <w:numPr>
-          <w:ilvl w:val="0"/>
-          <w:numId w:val="2"/>
-        </w:numPr>
-        <w:spacing w:after="40" w:before="40"/>
-      </w:pPr>
-      <w:r>
-        <w:rPr>
-          <w:rFonts w:ascii="Arial" w:cs="Arial" w:eastAsia="Arial" w:hAnsi="Arial"/>
-          <w:color w:val="333333"/>
-          <w:sz w:val="22"/>
-          <w:szCs w:val="22"/>
-        </w:rPr>
-        <w:t xml:space="preserve">Token balances are held by the contract's own jetton wallet address (a child wallet derived from the master), not the contract address itself — this is correct per the TON jetton standard.</w:t>
-      </w:r>
-    </w:p>
-    <w:p>
-      <w:pPr>
-        <w:pStyle w:val="ListParagraph"/>
-        <w:numPr>
-          <w:ilvl w:val="0"/>
-          <w:numId w:val="2"/>
-        </w:numPr>
-        <w:spacing w:after="40" w:before="40"/>
-      </w:pPr>
-      <w:r>
-        <w:rPr>
-          <w:rFonts w:ascii="Arial" w:cs="Arial" w:eastAsia="Arial" w:hAnsi="Arial"/>
-          <w:color w:val="333333"/>
-          <w:sz w:val="22"/>
-          <w:szCs w:val="22"/>
-        </w:rPr>
-        <w:t xml:space="preserve">The contract cannot be upgraded after deployment — distribution logic is immutable per pool.</w:t>
+        <w:t xml:space="preserve">Only the admin wallet address can call DistributeRewards or CancelPool. All other callers are rejected.</w:t>
+      </w:r>
+    </w:p>
+    <w:p>
+      <w:pPr>
+        <w:pStyle w:val="ListParagraph"/>
+        <w:numPr>
+          <w:ilvl w:val="0"/>
+          <w:numId w:val="2"/>
+        </w:numPr>
+        <w:spacing w:after="40" w:before="40"/>
+      </w:pPr>
+      <w:r>
+        <w:rPr>
+          <w:rFonts w:ascii="Arial" w:cs="Arial" w:eastAsia="Arial" w:hAnsi="Arial"/>
+          <w:color w:val="333333"/>
+          <w:sz w:val="22"/>
+          <w:szCs w:val="22"/>
+        </w:rPr>
+        <w:t xml:space="preserve">Token balances are held by the contract's own jetton wallet address, which is a child wallet derived from the master. This follows the TON jetton standard correctly.</w:t>
+      </w:r>
+    </w:p>
+    <w:p>
+      <w:pPr>
+        <w:pStyle w:val="ListParagraph"/>
+        <w:numPr>
+          <w:ilvl w:val="0"/>
+          <w:numId w:val="2"/>
+        </w:numPr>
+        <w:spacing w:after="40" w:before="40"/>
+      </w:pPr>
+      <w:r>
+        <w:rPr>
+          <w:rFonts w:ascii="Arial" w:cs="Arial" w:eastAsia="Arial" w:hAnsi="Arial"/>
+          <w:color w:val="333333"/>
+          <w:sz w:val="22"/>
+          <w:szCs w:val="22"/>
+        </w:rPr>
+        <w:t xml:space="preserve">The contract cannot be upgraded after deployment. Distribution logic is immutable per pool.</w:t>
       </w:r>
     </w:p>
     <w:p>
@@ -7526,7 +7526,7 @@
           <w:sz w:val="22"/>
           <w:szCs w:val="22"/>
         </w:rPr>
-        <w:t xml:space="preserve">All access fees are sent directly to the Gramketing treasury wallet at the time of pool creation. Fees are non-refundable. The fee is a separate transaction from the pool reward deposit — the reward tokens go to the escrow contract, not the treasury.</w:t>
+        <w:t xml:space="preserve">All access fees are sent directly to the Gramketing treasury wallet at the time of pool creation. Fees are non-refundable. The fee is a separate transaction from the pool reward deposit. Reward tokens go to the escrow contract, not the treasury.</w:t>
       </w:r>
     </w:p>
     <w:p>
@@ -7747,26 +7747,26 @@
           <w:sz w:val="22"/>
           <w:szCs w:val="22"/>
         </w:rPr>
-        <w:t xml:space="preserve">Access fee payment — projects can pay pool creation fees in $mGRAM at a preferential rate vs TON.</w:t>
-      </w:r>
-    </w:p>
-    <w:p>
-      <w:pPr>
-        <w:pStyle w:val="ListParagraph"/>
-        <w:numPr>
-          <w:ilvl w:val="0"/>
-          <w:numId w:val="2"/>
-        </w:numPr>
-        <w:spacing w:after="40" w:before="40"/>
-      </w:pPr>
-      <w:r>
-        <w:rPr>
-          <w:rFonts w:ascii="Arial" w:cs="Arial" w:eastAsia="Arial" w:hAnsi="Arial"/>
-          <w:color w:val="333333"/>
-          <w:sz w:val="22"/>
-          <w:szCs w:val="22"/>
-        </w:rPr>
-        <w:t xml:space="preserve">Platform alignment — holding $mGRAM signals commitment to the Gramketing ecosystem.</w:t>
+        <w:t xml:space="preserve">Access fee payment: projects can pay pool creation fees in $mGRAM at a preferential rate compared to TON.</w:t>
+      </w:r>
+    </w:p>
+    <w:p>
+      <w:pPr>
+        <w:pStyle w:val="ListParagraph"/>
+        <w:numPr>
+          <w:ilvl w:val="0"/>
+          <w:numId w:val="2"/>
+        </w:numPr>
+        <w:spacing w:after="40" w:before="40"/>
+      </w:pPr>
+      <w:r>
+        <w:rPr>
+          <w:rFonts w:ascii="Arial" w:cs="Arial" w:eastAsia="Arial" w:hAnsi="Arial"/>
+          <w:color w:val="333333"/>
+          <w:sz w:val="22"/>
+          <w:szCs w:val="22"/>
+        </w:rPr>
+        <w:t xml:space="preserve">Platform alignment: holding $mGRAM signals a commitment to the Gramketing ecosystem.</w:t>
       </w:r>
     </w:p>
     <w:p>
@@ -7813,45 +7813,45 @@
           <w:sz w:val="22"/>
           <w:szCs w:val="22"/>
         </w:rPr>
-        <w:t xml:space="preserve">Pool creation gate — future versions of the platform will require a minimum $mGRAM holding to create pools, creating a demand floor.</w:t>
-      </w:r>
-    </w:p>
-    <w:p>
-      <w:pPr>
-        <w:pStyle w:val="ListParagraph"/>
-        <w:numPr>
-          <w:ilvl w:val="0"/>
-          <w:numId w:val="2"/>
-        </w:numPr>
-        <w:spacing w:after="40" w:before="40"/>
-      </w:pPr>
-      <w:r>
-        <w:rPr>
-          <w:rFonts w:ascii="Arial" w:cs="Arial" w:eastAsia="Arial" w:hAnsi="Arial"/>
-          <w:color w:val="333333"/>
-          <w:sz w:val="22"/>
-          <w:szCs w:val="22"/>
-        </w:rPr>
-        <w:t xml:space="preserve">Governance — $mGRAM holders will be able to vote on platform parameter changes (fee levels, boost caps, etc.).</w:t>
-      </w:r>
-    </w:p>
-    <w:p>
-      <w:pPr>
-        <w:pStyle w:val="ListParagraph"/>
-        <w:numPr>
-          <w:ilvl w:val="0"/>
-          <w:numId w:val="2"/>
-        </w:numPr>
-        <w:spacing w:after="40" w:before="40"/>
-      </w:pPr>
-      <w:r>
-        <w:rPr>
-          <w:rFonts w:ascii="Arial" w:cs="Arial" w:eastAsia="Arial" w:hAnsi="Arial"/>
-          <w:color w:val="333333"/>
-          <w:sz w:val="22"/>
-          <w:szCs w:val="22"/>
-        </w:rPr>
-        <w:t xml:space="preserve">Staking — staking $mGRAM for reduced fees or enhanced platform features is planned for a future phase.</w:t>
+        <w:t xml:space="preserve">Pool creation gate: future versions of the platform will require a minimum $mGRAM holding to create pools.</w:t>
+      </w:r>
+    </w:p>
+    <w:p>
+      <w:pPr>
+        <w:pStyle w:val="ListParagraph"/>
+        <w:numPr>
+          <w:ilvl w:val="0"/>
+          <w:numId w:val="2"/>
+        </w:numPr>
+        <w:spacing w:after="40" w:before="40"/>
+      </w:pPr>
+      <w:r>
+        <w:rPr>
+          <w:rFonts w:ascii="Arial" w:cs="Arial" w:eastAsia="Arial" w:hAnsi="Arial"/>
+          <w:color w:val="333333"/>
+          <w:sz w:val="22"/>
+          <w:szCs w:val="22"/>
+        </w:rPr>
+        <w:t xml:space="preserve">Governance: $mGRAM holders will be able to vote on platform parameter changes such as fee levels and boost caps.</w:t>
+      </w:r>
+    </w:p>
+    <w:p>
+      <w:pPr>
+        <w:pStyle w:val="ListParagraph"/>
+        <w:numPr>
+          <w:ilvl w:val="0"/>
+          <w:numId w:val="2"/>
+        </w:numPr>
+        <w:spacing w:after="40" w:before="40"/>
+      </w:pPr>
+      <w:r>
+        <w:rPr>
+          <w:rFonts w:ascii="Arial" w:cs="Arial" w:eastAsia="Arial" w:hAnsi="Arial"/>
+          <w:color w:val="333333"/>
+          <w:sz w:val="22"/>
+          <w:szCs w:val="22"/>
+        </w:rPr>
+        <w:t xml:space="preserve">Staking: staking $mGRAM for reduced fees or enhanced platform features is planned for a future phase.</w:t>
       </w:r>
     </w:p>
     <w:p>
@@ -8521,7 +8521,7 @@
           <w:sz w:val="22"/>
           <w:szCs w:val="22"/>
         </w:rPr>
-        <w:t xml:space="preserve">A minimum of 100 views is required before a post can be submitted — this filters out bot-generated posts with no real reach.</w:t>
+        <w:t xml:space="preserve">A minimum of 100 views is required before a post can be submitted. This filters out posts with no real reach.</w:t>
       </w:r>
     </w:p>
     <w:p>
@@ -8568,26 +8568,26 @@
           <w:sz w:val="22"/>
           <w:szCs w:val="22"/>
         </w:rPr>
-        <w:t xml:space="preserve">Maximum 2 posts per platform per pool per day — prevents spam submissions.</w:t>
-      </w:r>
-    </w:p>
-    <w:p>
-      <w:pPr>
-        <w:pStyle w:val="ListParagraph"/>
-        <w:numPr>
-          <w:ilvl w:val="0"/>
-          <w:numId w:val="2"/>
-        </w:numPr>
-        <w:spacing w:after="40" w:before="40"/>
-      </w:pPr>
-      <w:r>
-        <w:rPr>
-          <w:rFonts w:ascii="Arial" w:cs="Arial" w:eastAsia="Arial" w:hAnsi="Arial"/>
-          <w:color w:val="333333"/>
-          <w:sz w:val="22"/>
-          <w:szCs w:val="22"/>
-        </w:rPr>
-        <w:t xml:space="preserve">Posts must belong to the wallet's linked X account or Telegram channel — prevents cross-account abuse.</w:t>
+        <w:t xml:space="preserve">Maximum 2 posts per platform per pool per day to prevent spam submissions.</w:t>
+      </w:r>
+    </w:p>
+    <w:p>
+      <w:pPr>
+        <w:pStyle w:val="ListParagraph"/>
+        <w:numPr>
+          <w:ilvl w:val="0"/>
+          <w:numId w:val="2"/>
+        </w:numPr>
+        <w:spacing w:after="40" w:before="40"/>
+      </w:pPr>
+      <w:r>
+        <w:rPr>
+          <w:rFonts w:ascii="Arial" w:cs="Arial" w:eastAsia="Arial" w:hAnsi="Arial"/>
+          <w:color w:val="333333"/>
+          <w:sz w:val="22"/>
+          <w:szCs w:val="22"/>
+        </w:rPr>
+        <w:t xml:space="preserve">Posts must belong to the wallet's linked X account or Telegram channel to prevent cross-account abuse.</w:t>
       </w:r>
     </w:p>
     <w:p>
@@ -8691,7 +8691,7 @@
           <w:sz w:val="22"/>
           <w:szCs w:val="22"/>
         </w:rPr>
-        <w:t xml:space="preserve">Unlinking has a 7-day cooldown — a user cannot unlink and relink to a new wallet more than once per week.</w:t>
+        <w:t xml:space="preserve">Unlinking has a 7-day cooldown. Users cannot unlink and relink to a new wallet more than once per week.</w:t>
       </w:r>
     </w:p>
     <w:p>
@@ -8768,7 +8768,7 @@
           <w:sz w:val="22"/>
           <w:szCs w:val="22"/>
         </w:rPr>
-        <w:t xml:space="preserve">All points already earned from that platform are retained — they are not deducted from the leaderboard.</w:t>
+        <w:t xml:space="preserve">All points already earned from that platform are retained and will not be deducted from the leaderboard.</w:t>
       </w:r>
     </w:p>
     <w:p>
@@ -8806,7 +8806,7 @@
           <w:sz w:val="22"/>
           <w:szCs w:val="22"/>
         </w:rPr>
-        <w:t xml:space="preserve">Earnings from the other platform continue unaffected — unlinking X does not affect Telegram point accumulation, and vice versa.</w:t>
+        <w:t xml:space="preserve">Earnings from the other platform continue unaffected. Unlinking X does not affect Telegram point accumulation and vice versa.</w:t>
       </w:r>
     </w:p>
     <w:p>
@@ -8891,64 +8891,64 @@
           <w:sz w:val="22"/>
           <w:szCs w:val="22"/>
         </w:rPr>
-        <w:t xml:space="preserve">Ban marketers — flag and remove a wallet's submissions from all active leaderboards.</w:t>
-      </w:r>
-    </w:p>
-    <w:p>
-      <w:pPr>
-        <w:pStyle w:val="ListParagraph"/>
-        <w:numPr>
-          <w:ilvl w:val="0"/>
-          <w:numId w:val="2"/>
-        </w:numPr>
-        <w:spacing w:after="40" w:before="40"/>
-      </w:pPr>
-      <w:r>
-        <w:rPr>
-          <w:rFonts w:ascii="Arial" w:cs="Arial" w:eastAsia="Arial" w:hAnsi="Arial"/>
-          <w:color w:val="333333"/>
-          <w:sz w:val="22"/>
-          <w:szCs w:val="22"/>
-        </w:rPr>
-        <w:t xml:space="preserve">Pause/cancel pool — halt an active pool and refund tokens to the project if abuse is detected.</w:t>
-      </w:r>
-    </w:p>
-    <w:p>
-      <w:pPr>
-        <w:pStyle w:val="ListParagraph"/>
-        <w:numPr>
-          <w:ilvl w:val="0"/>
-          <w:numId w:val="2"/>
-        </w:numPr>
-        <w:spacing w:after="40" w:before="40"/>
-      </w:pPr>
-      <w:r>
-        <w:rPr>
-          <w:rFonts w:ascii="Arial" w:cs="Arial" w:eastAsia="Arial" w:hAnsi="Arial"/>
-          <w:color w:val="333333"/>
-          <w:sz w:val="22"/>
-          <w:szCs w:val="22"/>
-        </w:rPr>
-        <w:t xml:space="preserve">Re-scrape trigger — force re-fetch of a specific submission if data appears incorrect.</w:t>
-      </w:r>
-    </w:p>
-    <w:p>
-      <w:pPr>
-        <w:pStyle w:val="ListParagraph"/>
-        <w:numPr>
-          <w:ilvl w:val="0"/>
-          <w:numId w:val="2"/>
-        </w:numPr>
-        <w:spacing w:after="40" w:before="40"/>
-      </w:pPr>
-      <w:r>
-        <w:rPr>
-          <w:rFonts w:ascii="Arial" w:cs="Arial" w:eastAsia="Arial" w:hAnsi="Arial"/>
-          <w:color w:val="333333"/>
-          <w:sz w:val="22"/>
-          <w:szCs w:val="22"/>
-        </w:rPr>
-        <w:t xml:space="preserve">Revenue dashboard — monitor all fee activity across the platform in real time.</w:t>
+        <w:t xml:space="preserve">Ban contributors: flag and remove a wallet's submissions from all active leaderboards.</w:t>
+      </w:r>
+    </w:p>
+    <w:p>
+      <w:pPr>
+        <w:pStyle w:val="ListParagraph"/>
+        <w:numPr>
+          <w:ilvl w:val="0"/>
+          <w:numId w:val="2"/>
+        </w:numPr>
+        <w:spacing w:after="40" w:before="40"/>
+      </w:pPr>
+      <w:r>
+        <w:rPr>
+          <w:rFonts w:ascii="Arial" w:cs="Arial" w:eastAsia="Arial" w:hAnsi="Arial"/>
+          <w:color w:val="333333"/>
+          <w:sz w:val="22"/>
+          <w:szCs w:val="22"/>
+        </w:rPr>
+        <w:t xml:space="preserve">Pause or cancel a pool: halt an active pool and process a pro-rata refund if abuse is detected.</w:t>
+      </w:r>
+    </w:p>
+    <w:p>
+      <w:pPr>
+        <w:pStyle w:val="ListParagraph"/>
+        <w:numPr>
+          <w:ilvl w:val="0"/>
+          <w:numId w:val="2"/>
+        </w:numPr>
+        <w:spacing w:after="40" w:before="40"/>
+      </w:pPr>
+      <w:r>
+        <w:rPr>
+          <w:rFonts w:ascii="Arial" w:cs="Arial" w:eastAsia="Arial" w:hAnsi="Arial"/>
+          <w:color w:val="333333"/>
+          <w:sz w:val="22"/>
+          <w:szCs w:val="22"/>
+        </w:rPr>
+        <w:t xml:space="preserve">Re-scrape trigger: force a re-fetch of any specific submission if the data appears incorrect.</w:t>
+      </w:r>
+    </w:p>
+    <w:p>
+      <w:pPr>
+        <w:pStyle w:val="ListParagraph"/>
+        <w:numPr>
+          <w:ilvl w:val="0"/>
+          <w:numId w:val="2"/>
+        </w:numPr>
+        <w:spacing w:after="40" w:before="40"/>
+      </w:pPr>
+      <w:r>
+        <w:rPr>
+          <w:rFonts w:ascii="Arial" w:cs="Arial" w:eastAsia="Arial" w:hAnsi="Arial"/>
+          <w:color w:val="333333"/>
+          <w:sz w:val="22"/>
+          <w:szCs w:val="22"/>
+        </w:rPr>
+        <w:t xml:space="preserve">Revenue dashboard: monitor all fee activity across the platform in real time.</w:t>
       </w:r>
     </w:p>
     <w:p>

</xml_diff>